<commit_message>
Deploying to gh-pages from @ Morrison-Lab/mds@d6ffe12f210ac8b24be884db74dfa671bdbf967f 🚀
</commit_message>
<xml_diff>
--- a/calculus-double-integrals.docx
+++ b/calculus-double-integrals.docx
@@ -15,10 +15,10 @@
         <w:pStyle w:val="Date"/>
       </w:pPr>
       <w:r>
-        <w:t xml:space="preserve">Last modified: 2026-10-14 13:15:43 (PDT)</w:t>
+        <w:t xml:space="preserve">Last modified: 2026-10-14 23:45:57 (PDT)</w:t>
       </w:r>
     </w:p>
-    <w:bookmarkStart w:id="83" w:name="sec-double-integrals"/>
+    <w:bookmarkStart w:id="85" w:name="sec-double-integrals"/>
     <w:p>
       <w:pPr>
         <w:pStyle w:val="Heading2"/>
@@ -60,7 +60,7 @@
         <w:t xml:space="preserve"> </w:t>
       </w:r>
       <w:r>
-        <w:t xml:space="preserve">We state two versions:</w:t>
+        <w:t xml:space="preserve">We state them in two settings:</w:t>
       </w:r>
       <w:r>
         <w:t xml:space="preserve"> </w:t>
@@ -111,9 +111,15 @@
         <w:t xml:space="preserve"> </w:t>
       </w:r>
       <w:r>
-        <w:t xml:space="preserve">measure-theoretic version (</w:t>
-      </w:r>
-      <w:hyperlink w:anchor="thm-fubini-tonelli">
+        <w:t xml:space="preserve">measure-theoretic versions</w:t>
+      </w:r>
+      <w:r>
+        <w:t xml:space="preserve"> </w:t>
+      </w:r>
+      <w:r>
+        <w:t xml:space="preserve">(</w:t>
+      </w:r>
+      <w:hyperlink w:anchor="thm-tonelli-measure">
         <w:r>
           <w:rPr>
             <w:rStyle w:val="Hyperlink"/>
@@ -122,7 +128,24 @@
         </w:r>
       </w:hyperlink>
       <w:r>
-        <w:t xml:space="preserve">) is</w:t>
+        <w:t xml:space="preserve"> </w:t>
+      </w:r>
+      <w:r>
+        <w:t xml:space="preserve">and</w:t>
+      </w:r>
+      <w:r>
+        <w:t xml:space="preserve"> </w:t>
+      </w:r>
+      <w:hyperlink w:anchor="thm-fubini-measure">
+        <w:r>
+          <w:rPr>
+            <w:rStyle w:val="Hyperlink"/>
+          </w:rPr>
+          <w:t xml:space="preserve">Theorem 3</w:t>
+        </w:r>
+      </w:hyperlink>
+      <w:r>
+        <w:t xml:space="preserve">) are</w:t>
       </w:r>
       <w:r>
         <w:t xml:space="preserve"> </w:t>
@@ -26843,17 +26866,24 @@
       </w:r>
     </w:p>
     <w:bookmarkEnd w:id="56"/>
-    <w:bookmarkStart w:id="64" w:name="thm-fubini-tonelli"/>
     <w:p>
       <w:pPr>
         <w:pStyle w:val="BodyText"/>
       </w:pPr>
+      <w:bookmarkStart w:id="57" w:name="thm-fubini-tonelli"/>
+      <w:bookmarkEnd w:id="57"/>
+    </w:p>
+    <w:bookmarkStart w:id="64" w:name="thm-tonelli-measure"/>
+    <w:p>
+      <w:pPr>
+        <w:pStyle w:val="BodyText"/>
+      </w:pPr>
       <w:r>
         <w:rPr>
           <w:b/>
           <w:bCs/>
         </w:rPr>
-        <w:t xml:space="preserve">Theorem 2 (Fubini–Tonelli theorem (measure-theoretic form))</w:t>
+        <w:t xml:space="preserve">Theorem 2 (Tonelli’s theorem (measure-theoretic form))</w:t>
       </w:r>
       <w:r>
         <w:t xml:space="preserve"> </w:t>
@@ -27020,7 +27050,7 @@
       <w:r>
         <w:t xml:space="preserve"> </w:t>
       </w:r>
-      <w:hyperlink r:id="rId57">
+      <w:hyperlink r:id="rId58">
         <w:r>
           <w:rPr>
             <w:rStyle w:val="Hyperlink"/>
@@ -27134,7 +27164,7 @@
       <w:r>
         <w:t xml:space="preserve"> </w:t>
       </w:r>
-      <w:hyperlink r:id="rId58">
+      <w:hyperlink r:id="rId59">
         <w:r>
           <w:rPr>
             <w:rStyle w:val="Hyperlink"/>
@@ -27151,7 +27181,7 @@
       <w:r>
         <w:t xml:space="preserve"> </w:t>
       </w:r>
-      <w:hyperlink r:id="rId59">
+      <w:hyperlink r:id="rId60">
         <w:r>
           <w:rPr>
             <w:rStyle w:val="Hyperlink"/>
@@ -27226,16 +27256,11 @@
         <w:t xml:space="preserve"> </w:t>
       </w:r>
       <w:r>
-        <w:t xml:space="preserve">If either</w:t>
-      </w:r>
-    </w:p>
-    <w:p>
-      <w:pPr>
-        <w:numPr>
-          <w:ilvl w:val="0"/>
-          <w:numId w:val="1002"/>
-        </w:numPr>
-      </w:pPr>
+        <w:t xml:space="preserve">If</w:t>
+      </w:r>
+      <w:r>
+        <w:t xml:space="preserve"> </w:t>
+      </w:r>
       <m:oMath>
         <m:r>
           <m:t>f</m:t>
@@ -27253,7 +27278,7 @@
       <w:r>
         <w:t xml:space="preserve"> </w:t>
       </w:r>
-      <w:hyperlink r:id="rId60">
+      <w:hyperlink r:id="rId61">
         <w:r>
           <w:rPr>
             <w:rStyle w:val="Hyperlink"/>
@@ -27270,7 +27295,7 @@
       <w:r>
         <w:t xml:space="preserve"> </w:t>
       </w:r>
-      <w:hyperlink r:id="rId61">
+      <w:hyperlink r:id="rId62">
         <w:r>
           <w:rPr>
             <w:rStyle w:val="Hyperlink"/>
@@ -27314,29 +27339,1025 @@
         </m:sSub>
       </m:oMath>
       <w:r>
-        <w:t xml:space="preserve"> </w:t>
-      </w:r>
-      <w:r>
-        <w:t xml:space="preserve">(</w:t>
-      </w:r>
+        <w:t xml:space="preserve">,</w:t>
+      </w:r>
+      <w:r>
+        <w:t xml:space="preserve"> </w:t>
+      </w:r>
+      <w:r>
+        <w:t xml:space="preserve">then both iterated</w:t>
+      </w:r>
+      <w:r>
+        <w:t xml:space="preserve"> </w:t>
+      </w:r>
+      <w:hyperlink r:id="rId63">
+        <w:r>
+          <w:rPr>
+            <w:rStyle w:val="Hyperlink"/>
+          </w:rPr>
+          <w:t xml:space="preserve">integrals</w:t>
+        </w:r>
+      </w:hyperlink>
+      <w:r>
+        <w:t xml:space="preserve"> </w:t>
+      </w:r>
+      <w:r>
+        <w:t xml:space="preserve">exist (possibly equal to</w:t>
+      </w:r>
+      <w:r>
+        <w:t xml:space="preserve"> </w:t>
+      </w:r>
+      <m:oMath>
+        <m:r>
+          <m:rPr>
+            <m:sty m:val="p"/>
+          </m:rPr>
+          <m:t>+</m:t>
+        </m:r>
+        <m:r>
+          <m:rPr>
+            <m:sty m:val="p"/>
+          </m:rPr>
+          <m:t>∞</m:t>
+        </m:r>
+      </m:oMath>
+      <w:r>
+        <w:t xml:space="preserve">),</w:t>
+      </w:r>
+      <w:r>
+        <w:t xml:space="preserve"> </w:t>
+      </w:r>
+      <w:r>
+        <w:t xml:space="preserve">agree with the double integral,</w:t>
+      </w:r>
+      <w:r>
+        <w:t xml:space="preserve"> </w:t>
+      </w:r>
+      <w:r>
+        <w:t xml:space="preserve">and equal each other:</w:t>
+      </w:r>
+    </w:p>
+    <w:p>
+      <w:pPr>
+        <w:pStyle w:val="BodyText"/>
+      </w:pPr>
+      <m:oMathPara>
+        <m:oMathParaPr>
+          <m:jc m:val="center"/>
+        </m:oMathParaPr>
+        <m:oMath>
+          <m:eqArr>
+            <m:e>
+              <m:nary>
+                <m:naryPr>
+                  <m:chr m:val="∫"/>
+                  <m:limLoc m:val="subSup"/>
+                  <m:subHide m:val="off"/>
+                  <m:supHide m:val="on"/>
+                </m:naryPr>
+                <m:sub>
+                  <m:sSub>
+                    <m:e>
+                      <m:r>
+                        <m:rPr>
+                          <m:sty m:val="p"/>
+                        </m:rPr>
+                        <m:t>Ω</m:t>
+                      </m:r>
+                    </m:e>
+                    <m:sub>
+                      <m:r>
+                        <m:t>1</m:t>
+                      </m:r>
+                    </m:sub>
+                  </m:sSub>
+                  <m:r>
+                    <m:rPr>
+                      <m:sty m:val="p"/>
+                    </m:rPr>
+                    <m:t>×</m:t>
+                  </m:r>
+                  <m:sSub>
+                    <m:e>
+                      <m:r>
+                        <m:rPr>
+                          <m:sty m:val="p"/>
+                        </m:rPr>
+                        <m:t>Ω</m:t>
+                      </m:r>
+                    </m:e>
+                    <m:sub>
+                      <m:r>
+                        <m:t>2</m:t>
+                      </m:r>
+                    </m:sub>
+                  </m:sSub>
+                </m:sub>
+                <m:sup>
+                  <m:r>
+                    <m:t>​</m:t>
+                  </m:r>
+                </m:sup>
+                <m:e>
+                  <m:r>
+                    <m:t>f</m:t>
+                  </m:r>
+                </m:e>
+              </m:nary>
+              <m:r>
+                <m:t> </m:t>
+              </m:r>
+              <m:r>
+                <m:t>d</m:t>
+              </m:r>
+              <m:r>
+                <m:rPr>
+                  <m:sty m:val="p"/>
+                </m:rPr>
+                <m:t>(</m:t>
+              </m:r>
+              <m:sSub>
+                <m:e>
+                  <m:r>
+                    <m:t>μ</m:t>
+                  </m:r>
+                </m:e>
+                <m:sub>
+                  <m:r>
+                    <m:t>1</m:t>
+                  </m:r>
+                </m:sub>
+              </m:sSub>
+              <m:r>
+                <m:rPr>
+                  <m:sty m:val="p"/>
+                </m:rPr>
+                <m:t>⊗</m:t>
+              </m:r>
+              <m:sSub>
+                <m:e>
+                  <m:r>
+                    <m:t>μ</m:t>
+                  </m:r>
+                </m:e>
+                <m:sub>
+                  <m:r>
+                    <m:t>2</m:t>
+                  </m:r>
+                </m:sub>
+              </m:sSub>
+              <m:r>
+                <m:rPr>
+                  <m:sty m:val="p"/>
+                </m:rPr>
+                <m:t>)</m:t>
+              </m:r>
+              <m:r>
+                <m:t>&amp;</m:t>
+              </m:r>
+              <m:r>
+                <m:rPr>
+                  <m:sty m:val="p"/>
+                </m:rPr>
+                <m:t>=</m:t>
+              </m:r>
+              <m:nary>
+                <m:naryPr>
+                  <m:chr m:val="∫"/>
+                  <m:limLoc m:val="subSup"/>
+                  <m:subHide m:val="off"/>
+                  <m:supHide m:val="on"/>
+                </m:naryPr>
+                <m:sub>
+                  <m:sSub>
+                    <m:e>
+                      <m:r>
+                        <m:rPr>
+                          <m:sty m:val="p"/>
+                        </m:rPr>
+                        <m:t>Ω</m:t>
+                      </m:r>
+                    </m:e>
+                    <m:sub>
+                      <m:r>
+                        <m:t>1</m:t>
+                      </m:r>
+                    </m:sub>
+                  </m:sSub>
+                </m:sub>
+                <m:sup>
+                  <m:r>
+                    <m:t>​</m:t>
+                  </m:r>
+                </m:sup>
+                <m:e>
+                  <m:r>
+                    <m:t>​</m:t>
+                  </m:r>
+                </m:e>
+              </m:nary>
+              <m:d>
+                <m:dPr>
+                  <m:begChr m:val="("/>
+                  <m:sepChr m:val=""/>
+                  <m:endChr m:val=")"/>
+                  <m:grow/>
+                </m:dPr>
+                <m:e>
+                  <m:nary>
+                    <m:naryPr>
+                      <m:chr m:val="∫"/>
+                      <m:limLoc m:val="subSup"/>
+                      <m:subHide m:val="off"/>
+                      <m:supHide m:val="on"/>
+                    </m:naryPr>
+                    <m:sub>
+                      <m:sSub>
+                        <m:e>
+                          <m:r>
+                            <m:rPr>
+                              <m:sty m:val="p"/>
+                            </m:rPr>
+                            <m:t>Ω</m:t>
+                          </m:r>
+                        </m:e>
+                        <m:sub>
+                          <m:r>
+                            <m:t>2</m:t>
+                          </m:r>
+                        </m:sub>
+                      </m:sSub>
+                    </m:sub>
+                    <m:sup>
+                      <m:r>
+                        <m:t>​</m:t>
+                      </m:r>
+                    </m:sup>
+                    <m:e>
+                      <m:r>
+                        <m:t>f</m:t>
+                      </m:r>
+                    </m:e>
+                  </m:nary>
+                  <m:r>
+                    <m:rPr>
+                      <m:sty m:val="p"/>
+                    </m:rPr>
+                    <m:t>(</m:t>
+                  </m:r>
+                  <m:sSub>
+                    <m:e>
+                      <m:r>
+                        <m:t>ω</m:t>
+                      </m:r>
+                    </m:e>
+                    <m:sub>
+                      <m:r>
+                        <m:t>1</m:t>
+                      </m:r>
+                    </m:sub>
+                  </m:sSub>
+                  <m:r>
+                    <m:rPr>
+                      <m:sty m:val="p"/>
+                    </m:rPr>
+                    <m:t>,</m:t>
+                  </m:r>
+                  <m:sSub>
+                    <m:e>
+                      <m:r>
+                        <m:t>ω</m:t>
+                      </m:r>
+                    </m:e>
+                    <m:sub>
+                      <m:r>
+                        <m:t>2</m:t>
+                      </m:r>
+                    </m:sub>
+                  </m:sSub>
+                  <m:r>
+                    <m:rPr>
+                      <m:sty m:val="p"/>
+                    </m:rPr>
+                    <m:t>)</m:t>
+                  </m:r>
+                  <m:r>
+                    <m:t> </m:t>
+                  </m:r>
+                  <m:r>
+                    <m:t>d</m:t>
+                  </m:r>
+                  <m:sSub>
+                    <m:e>
+                      <m:r>
+                        <m:t>μ</m:t>
+                      </m:r>
+                    </m:e>
+                    <m:sub>
+                      <m:r>
+                        <m:t>2</m:t>
+                      </m:r>
+                    </m:sub>
+                  </m:sSub>
+                  <m:r>
+                    <m:rPr>
+                      <m:sty m:val="p"/>
+                    </m:rPr>
+                    <m:t>(</m:t>
+                  </m:r>
+                  <m:sSub>
+                    <m:e>
+                      <m:r>
+                        <m:t>ω</m:t>
+                      </m:r>
+                    </m:e>
+                    <m:sub>
+                      <m:r>
+                        <m:t>2</m:t>
+                      </m:r>
+                    </m:sub>
+                  </m:sSub>
+                  <m:r>
+                    <m:rPr>
+                      <m:sty m:val="p"/>
+                    </m:rPr>
+                    <m:t>)</m:t>
+                  </m:r>
+                </m:e>
+              </m:d>
+              <m:r>
+                <m:t>​</m:t>
+              </m:r>
+              <m:r>
+                <m:t> </m:t>
+              </m:r>
+              <m:r>
+                <m:t>d</m:t>
+              </m:r>
+              <m:sSub>
+                <m:e>
+                  <m:r>
+                    <m:t>μ</m:t>
+                  </m:r>
+                </m:e>
+                <m:sub>
+                  <m:r>
+                    <m:t>1</m:t>
+                  </m:r>
+                </m:sub>
+              </m:sSub>
+              <m:r>
+                <m:rPr>
+                  <m:sty m:val="p"/>
+                </m:rPr>
+                <m:t>(</m:t>
+              </m:r>
+              <m:sSub>
+                <m:e>
+                  <m:r>
+                    <m:t>ω</m:t>
+                  </m:r>
+                </m:e>
+                <m:sub>
+                  <m:r>
+                    <m:t>1</m:t>
+                  </m:r>
+                </m:sub>
+              </m:sSub>
+              <m:r>
+                <m:rPr>
+                  <m:sty m:val="p"/>
+                </m:rPr>
+                <m:t>)</m:t>
+              </m:r>
+            </m:e>
+            <m:e>
+              <m:r>
+                <m:t>&amp;</m:t>
+              </m:r>
+              <m:r>
+                <m:rPr>
+                  <m:sty m:val="p"/>
+                </m:rPr>
+                <m:t>=</m:t>
+              </m:r>
+              <m:nary>
+                <m:naryPr>
+                  <m:chr m:val="∫"/>
+                  <m:limLoc m:val="subSup"/>
+                  <m:subHide m:val="off"/>
+                  <m:supHide m:val="on"/>
+                </m:naryPr>
+                <m:sub>
+                  <m:sSub>
+                    <m:e>
+                      <m:r>
+                        <m:rPr>
+                          <m:sty m:val="p"/>
+                        </m:rPr>
+                        <m:t>Ω</m:t>
+                      </m:r>
+                    </m:e>
+                    <m:sub>
+                      <m:r>
+                        <m:t>2</m:t>
+                      </m:r>
+                    </m:sub>
+                  </m:sSub>
+                </m:sub>
+                <m:sup>
+                  <m:r>
+                    <m:t>​</m:t>
+                  </m:r>
+                </m:sup>
+                <m:e>
+                  <m:r>
+                    <m:t>​</m:t>
+                  </m:r>
+                </m:e>
+              </m:nary>
+              <m:d>
+                <m:dPr>
+                  <m:begChr m:val="("/>
+                  <m:sepChr m:val=""/>
+                  <m:endChr m:val=")"/>
+                  <m:grow/>
+                </m:dPr>
+                <m:e>
+                  <m:nary>
+                    <m:naryPr>
+                      <m:chr m:val="∫"/>
+                      <m:limLoc m:val="subSup"/>
+                      <m:subHide m:val="off"/>
+                      <m:supHide m:val="on"/>
+                    </m:naryPr>
+                    <m:sub>
+                      <m:sSub>
+                        <m:e>
+                          <m:r>
+                            <m:rPr>
+                              <m:sty m:val="p"/>
+                            </m:rPr>
+                            <m:t>Ω</m:t>
+                          </m:r>
+                        </m:e>
+                        <m:sub>
+                          <m:r>
+                            <m:t>1</m:t>
+                          </m:r>
+                        </m:sub>
+                      </m:sSub>
+                    </m:sub>
+                    <m:sup>
+                      <m:r>
+                        <m:t>​</m:t>
+                      </m:r>
+                    </m:sup>
+                    <m:e>
+                      <m:r>
+                        <m:t>f</m:t>
+                      </m:r>
+                    </m:e>
+                  </m:nary>
+                  <m:r>
+                    <m:rPr>
+                      <m:sty m:val="p"/>
+                    </m:rPr>
+                    <m:t>(</m:t>
+                  </m:r>
+                  <m:sSub>
+                    <m:e>
+                      <m:r>
+                        <m:t>ω</m:t>
+                      </m:r>
+                    </m:e>
+                    <m:sub>
+                      <m:r>
+                        <m:t>1</m:t>
+                      </m:r>
+                    </m:sub>
+                  </m:sSub>
+                  <m:r>
+                    <m:rPr>
+                      <m:sty m:val="p"/>
+                    </m:rPr>
+                    <m:t>,</m:t>
+                  </m:r>
+                  <m:sSub>
+                    <m:e>
+                      <m:r>
+                        <m:t>ω</m:t>
+                      </m:r>
+                    </m:e>
+                    <m:sub>
+                      <m:r>
+                        <m:t>2</m:t>
+                      </m:r>
+                    </m:sub>
+                  </m:sSub>
+                  <m:r>
+                    <m:rPr>
+                      <m:sty m:val="p"/>
+                    </m:rPr>
+                    <m:t>)</m:t>
+                  </m:r>
+                  <m:r>
+                    <m:t> </m:t>
+                  </m:r>
+                  <m:r>
+                    <m:t>d</m:t>
+                  </m:r>
+                  <m:sSub>
+                    <m:e>
+                      <m:r>
+                        <m:t>μ</m:t>
+                      </m:r>
+                    </m:e>
+                    <m:sub>
+                      <m:r>
+                        <m:t>1</m:t>
+                      </m:r>
+                    </m:sub>
+                  </m:sSub>
+                  <m:r>
+                    <m:rPr>
+                      <m:sty m:val="p"/>
+                    </m:rPr>
+                    <m:t>(</m:t>
+                  </m:r>
+                  <m:sSub>
+                    <m:e>
+                      <m:r>
+                        <m:t>ω</m:t>
+                      </m:r>
+                    </m:e>
+                    <m:sub>
+                      <m:r>
+                        <m:t>1</m:t>
+                      </m:r>
+                    </m:sub>
+                  </m:sSub>
+                  <m:r>
+                    <m:rPr>
+                      <m:sty m:val="p"/>
+                    </m:rPr>
+                    <m:t>)</m:t>
+                  </m:r>
+                </m:e>
+              </m:d>
+              <m:r>
+                <m:t>​</m:t>
+              </m:r>
+              <m:r>
+                <m:t> </m:t>
+              </m:r>
+              <m:r>
+                <m:t>d</m:t>
+              </m:r>
+              <m:sSub>
+                <m:e>
+                  <m:r>
+                    <m:t>μ</m:t>
+                  </m:r>
+                </m:e>
+                <m:sub>
+                  <m:r>
+                    <m:t>2</m:t>
+                  </m:r>
+                </m:sub>
+              </m:sSub>
+              <m:r>
+                <m:rPr>
+                  <m:sty m:val="p"/>
+                </m:rPr>
+                <m:t>(</m:t>
+              </m:r>
+              <m:sSub>
+                <m:e>
+                  <m:r>
+                    <m:t>ω</m:t>
+                  </m:r>
+                </m:e>
+                <m:sub>
+                  <m:r>
+                    <m:t>2</m:t>
+                  </m:r>
+                </m:sub>
+              </m:sSub>
+              <m:r>
+                <m:rPr>
+                  <m:sty m:val="p"/>
+                </m:rPr>
+                <m:t>)</m:t>
+              </m:r>
+              <m:r>
+                <m:rPr>
+                  <m:sty m:val="p"/>
+                </m:rPr>
+                <m:t>.</m:t>
+              </m:r>
+            </m:e>
+          </m:eqArr>
+        </m:oMath>
+      </m:oMathPara>
+    </w:p>
+    <w:p>
+      <w:pPr>
+        <w:pStyle w:val="FirstParagraph"/>
+      </w:pPr>
+      <w:r>
+        <w:t xml:space="preserve">(Billingsley 1995, Theorem 18.3; Gut 2013, Theorem 9.1, p. 65; Wikipedia contributors 2024)</w:t>
+      </w:r>
+    </w:p>
+    <w:bookmarkEnd w:id="64"/>
+    <w:bookmarkStart w:id="66" w:name="thm-fubini-measure"/>
+    <w:p>
+      <w:pPr>
+        <w:pStyle w:val="BodyText"/>
+      </w:pPr>
       <w:r>
         <w:rPr>
           <w:b/>
           <w:bCs/>
         </w:rPr>
-        <w:t xml:space="preserve">Tonelli’s theorem</w:t>
-      </w:r>
-      <w:r>
-        <w:t xml:space="preserve">), or</w:t>
-      </w:r>
-    </w:p>
-    <w:p>
-      <w:pPr>
-        <w:numPr>
-          <w:ilvl w:val="0"/>
-          <w:numId w:val="1002"/>
-        </w:numPr>
-      </w:pPr>
+        <w:t xml:space="preserve">Theorem 3 (Fubini’s theorem (measure-theoretic form))</w:t>
+      </w:r>
+      <w:r>
+        <w:t xml:space="preserve"> </w:t>
+      </w:r>
+      <w:r>
+        <w:t xml:space="preserve">Let</w:t>
+      </w:r>
+      <w:r>
+        <w:t xml:space="preserve"> </w:t>
+      </w:r>
+      <m:oMath>
+        <m:r>
+          <m:rPr>
+            <m:sty m:val="p"/>
+          </m:rPr>
+          <m:t>(</m:t>
+        </m:r>
+        <m:sSub>
+          <m:e>
+            <m:r>
+              <m:rPr>
+                <m:sty m:val="p"/>
+              </m:rPr>
+              <m:t>Ω</m:t>
+            </m:r>
+          </m:e>
+          <m:sub>
+            <m:r>
+              <m:t>1</m:t>
+            </m:r>
+          </m:sub>
+        </m:sSub>
+        <m:r>
+          <m:rPr>
+            <m:sty m:val="p"/>
+          </m:rPr>
+          <m:t>,</m:t>
+        </m:r>
+        <m:sSub>
+          <m:e>
+            <m:r>
+              <m:rPr>
+                <m:scr m:val="script"/>
+                <m:sty m:val="p"/>
+              </m:rPr>
+              <m:t>F</m:t>
+            </m:r>
+          </m:e>
+          <m:sub>
+            <m:r>
+              <m:t>1</m:t>
+            </m:r>
+          </m:sub>
+        </m:sSub>
+        <m:r>
+          <m:rPr>
+            <m:sty m:val="p"/>
+          </m:rPr>
+          <m:t>,</m:t>
+        </m:r>
+        <m:sSub>
+          <m:e>
+            <m:r>
+              <m:t>μ</m:t>
+            </m:r>
+          </m:e>
+          <m:sub>
+            <m:r>
+              <m:t>1</m:t>
+            </m:r>
+          </m:sub>
+        </m:sSub>
+        <m:r>
+          <m:rPr>
+            <m:sty m:val="p"/>
+          </m:rPr>
+          <m:t>)</m:t>
+        </m:r>
+      </m:oMath>
+      <w:r>
+        <w:t xml:space="preserve"> </w:t>
+      </w:r>
+      <w:r>
+        <w:t xml:space="preserve">and</w:t>
+      </w:r>
+      <w:r>
+        <w:t xml:space="preserve"> </w:t>
+      </w:r>
+      <m:oMath>
+        <m:r>
+          <m:rPr>
+            <m:sty m:val="p"/>
+          </m:rPr>
+          <m:t>(</m:t>
+        </m:r>
+        <m:sSub>
+          <m:e>
+            <m:r>
+              <m:rPr>
+                <m:sty m:val="p"/>
+              </m:rPr>
+              <m:t>Ω</m:t>
+            </m:r>
+          </m:e>
+          <m:sub>
+            <m:r>
+              <m:t>2</m:t>
+            </m:r>
+          </m:sub>
+        </m:sSub>
+        <m:r>
+          <m:rPr>
+            <m:sty m:val="p"/>
+          </m:rPr>
+          <m:t>,</m:t>
+        </m:r>
+        <m:sSub>
+          <m:e>
+            <m:r>
+              <m:rPr>
+                <m:scr m:val="script"/>
+                <m:sty m:val="p"/>
+              </m:rPr>
+              <m:t>F</m:t>
+            </m:r>
+          </m:e>
+          <m:sub>
+            <m:r>
+              <m:t>2</m:t>
+            </m:r>
+          </m:sub>
+        </m:sSub>
+        <m:r>
+          <m:rPr>
+            <m:sty m:val="p"/>
+          </m:rPr>
+          <m:t>,</m:t>
+        </m:r>
+        <m:sSub>
+          <m:e>
+            <m:r>
+              <m:t>μ</m:t>
+            </m:r>
+          </m:e>
+          <m:sub>
+            <m:r>
+              <m:t>2</m:t>
+            </m:r>
+          </m:sub>
+        </m:sSub>
+        <m:r>
+          <m:rPr>
+            <m:sty m:val="p"/>
+          </m:rPr>
+          <m:t>)</m:t>
+        </m:r>
+      </m:oMath>
+      <w:r>
+        <w:t xml:space="preserve"> </w:t>
+      </w:r>
+      <w:r>
+        <w:t xml:space="preserve">be</w:t>
+      </w:r>
+      <w:r>
+        <w:t xml:space="preserve"> </w:t>
+      </w:r>
+      <w:hyperlink r:id="rId58">
+        <w:r>
+          <w:rPr>
+            <w:rStyle w:val="Hyperlink"/>
+          </w:rPr>
+          <w:t xml:space="preserve">measure spaces</w:t>
+        </w:r>
+      </w:hyperlink>
+      <w:r>
+        <w:t xml:space="preserve"> </w:t>
+      </w:r>
+      <w:r>
+        <w:t xml:space="preserve">with</w:t>
+      </w:r>
+      <w:r>
+        <w:t xml:space="preserve"> </w:t>
+      </w:r>
+      <w:hyperlink r:id="rId9">
+        <m:oMath>
+          <m:r>
+            <m:t>σ</m:t>
+          </m:r>
+        </m:oMath>
+        <w:r>
+          <w:rPr>
+            <w:rStyle w:val="Hyperlink"/>
+          </w:rPr>
+          <w:t xml:space="preserve">-finite</w:t>
+        </w:r>
+      </w:hyperlink>
+      <w:r>
+        <w:t xml:space="preserve"> </w:t>
+      </w:r>
+      <w:r>
+        <w:t xml:space="preserve">measures,</w:t>
+      </w:r>
+      <w:r>
+        <w:t xml:space="preserve"> </w:t>
+      </w:r>
+      <w:r>
+        <w:t xml:space="preserve">and let</w:t>
+      </w:r>
+      <w:r>
+        <w:t xml:space="preserve"> </w:t>
+      </w:r>
+      <m:oMath>
+        <m:r>
+          <m:t>f</m:t>
+        </m:r>
+        <m:r>
+          <m:rPr>
+            <m:sty m:val="p"/>
+          </m:rPr>
+          <m:t>:</m:t>
+        </m:r>
+        <m:sSub>
+          <m:e>
+            <m:r>
+              <m:rPr>
+                <m:sty m:val="p"/>
+              </m:rPr>
+              <m:t>Ω</m:t>
+            </m:r>
+          </m:e>
+          <m:sub>
+            <m:r>
+              <m:t>1</m:t>
+            </m:r>
+          </m:sub>
+        </m:sSub>
+        <m:r>
+          <m:rPr>
+            <m:sty m:val="p"/>
+          </m:rPr>
+          <m:t>×</m:t>
+        </m:r>
+        <m:sSub>
+          <m:e>
+            <m:r>
+              <m:rPr>
+                <m:sty m:val="p"/>
+              </m:rPr>
+              <m:t>Ω</m:t>
+            </m:r>
+          </m:e>
+          <m:sub>
+            <m:r>
+              <m:t>2</m:t>
+            </m:r>
+          </m:sub>
+        </m:sSub>
+        <m:r>
+          <m:rPr>
+            <m:sty m:val="p"/>
+          </m:rPr>
+          <m:t>→</m:t>
+        </m:r>
+        <m:r>
+          <m:rPr>
+            <m:scr m:val="double-struck"/>
+            <m:sty m:val="p"/>
+          </m:rPr>
+          <m:t>R</m:t>
+        </m:r>
+      </m:oMath>
+      <w:r>
+        <w:t xml:space="preserve"> </w:t>
+      </w:r>
+      <w:r>
+        <w:t xml:space="preserve">be</w:t>
+      </w:r>
+      <w:r>
+        <w:t xml:space="preserve"> </w:t>
+      </w:r>
+      <w:hyperlink r:id="rId59">
+        <w:r>
+          <w:rPr>
+            <w:rStyle w:val="Hyperlink"/>
+          </w:rPr>
+          <w:t xml:space="preserve">measurable</w:t>
+        </w:r>
+      </w:hyperlink>
+      <w:r>
+        <w:t xml:space="preserve"> </w:t>
+      </w:r>
+      <w:r>
+        <w:t xml:space="preserve">with respect to the</w:t>
+      </w:r>
+      <w:r>
+        <w:t xml:space="preserve"> </w:t>
+      </w:r>
+      <w:hyperlink r:id="rId60">
+        <w:r>
+          <w:rPr>
+            <w:rStyle w:val="Hyperlink"/>
+          </w:rPr>
+          <w:t xml:space="preserve">product</w:t>
+        </w:r>
+        <w:r>
+          <w:rPr>
+            <w:rStyle w:val="Hyperlink"/>
+          </w:rPr>
+          <w:t xml:space="preserve"> </w:t>
+        </w:r>
+        <m:oMath>
+          <m:r>
+            <m:t>σ</m:t>
+          </m:r>
+        </m:oMath>
+        <w:r>
+          <w:rPr>
+            <w:rStyle w:val="Hyperlink"/>
+          </w:rPr>
+          <w:t xml:space="preserve">-algebra</w:t>
+        </w:r>
+      </w:hyperlink>
+      <w:r>
+        <w:t xml:space="preserve"> </w:t>
+      </w:r>
+      <m:oMath>
+        <m:sSub>
+          <m:e>
+            <m:r>
+              <m:rPr>
+                <m:scr m:val="script"/>
+                <m:sty m:val="p"/>
+              </m:rPr>
+              <m:t>F</m:t>
+            </m:r>
+          </m:e>
+          <m:sub>
+            <m:r>
+              <m:t>1</m:t>
+            </m:r>
+          </m:sub>
+        </m:sSub>
+        <m:r>
+          <m:rPr>
+            <m:sty m:val="p"/>
+          </m:rPr>
+          <m:t>⊗</m:t>
+        </m:r>
+        <m:sSub>
+          <m:e>
+            <m:r>
+              <m:rPr>
+                <m:scr m:val="script"/>
+                <m:sty m:val="p"/>
+              </m:rPr>
+              <m:t>F</m:t>
+            </m:r>
+          </m:e>
+          <m:sub>
+            <m:r>
+              <m:t>2</m:t>
+            </m:r>
+          </m:sub>
+        </m:sSub>
+      </m:oMath>
+      <w:r>
+        <w:t xml:space="preserve">.</w:t>
+      </w:r>
+      <w:r>
+        <w:t xml:space="preserve"> </w:t>
+      </w:r>
+      <w:r>
+        <w:t xml:space="preserve">If</w:t>
+      </w:r>
+      <w:r>
+        <w:t xml:space="preserve"> </w:t>
+      </w:r>
       <m:oMath>
         <m:nary>
           <m:naryPr>
@@ -27497,7 +28518,7 @@
       <w:r>
         <w:t xml:space="preserve"> </w:t>
       </w:r>
-      <w:hyperlink r:id="rId62">
+      <w:hyperlink r:id="rId65">
         <w:r>
           <w:rPr>
             <w:rStyle w:val="Hyperlink"/>
@@ -27506,26 +28527,11 @@
         </w:r>
       </w:hyperlink>
       <w:r>
-        <w:t xml:space="preserve"> </w:t>
-      </w:r>
-      <w:r>
-        <w:t xml:space="preserve">(</w:t>
-      </w:r>
-      <w:r>
-        <w:rPr>
-          <w:b/>
-          <w:bCs/>
-        </w:rPr>
-        <w:t xml:space="preserve">Fubini’s theorem</w:t>
-      </w:r>
-      <w:r>
-        <w:t xml:space="preserve">),</w:t>
-      </w:r>
-    </w:p>
-    <w:p>
-      <w:pPr>
-        <w:pStyle w:val="FirstParagraph"/>
-      </w:pPr>
+        <w:t xml:space="preserve">,</w:t>
+      </w:r>
+      <w:r>
+        <w:t xml:space="preserve"> </w:t>
+      </w:r>
       <w:r>
         <w:t xml:space="preserve">then both iterated</w:t>
       </w:r>
@@ -27544,7 +28550,13 @@
         <w:t xml:space="preserve"> </w:t>
       </w:r>
       <w:r>
-        <w:t xml:space="preserve">exist, agree with the double integral,</w:t>
+        <w:t xml:space="preserve">exist,</w:t>
+      </w:r>
+      <w:r>
+        <w:t xml:space="preserve"> </w:t>
+      </w:r>
+      <w:r>
+        <w:t xml:space="preserve">agree with the double integral,</w:t>
       </w:r>
       <w:r>
         <w:t xml:space="preserve"> </w:t>
@@ -28125,8 +29137,8 @@
         <w:t xml:space="preserve">(Billingsley 1995, Theorem 18.3; Gut 2013, Theorem 9.1, p. 65; Fubini 1907; Wikipedia contributors 2024)</w:t>
       </w:r>
     </w:p>
-    <w:bookmarkEnd w:id="64"/>
-    <w:bookmarkStart w:id="68" w:name="rem-fubini-tonelli-probability"/>
+    <w:bookmarkEnd w:id="66"/>
+    <w:bookmarkStart w:id="70" w:name="rem-fubini-tonelli-probability"/>
     <w:p>
       <w:pPr>
         <w:pStyle w:val="BodyText"/>
@@ -28189,7 +29201,7 @@
       <w:r>
         <w:t xml:space="preserve"> </w:t>
       </w:r>
-      <w:hyperlink r:id="rId65">
+      <w:hyperlink r:id="rId67">
         <w:r>
           <w:rPr>
             <w:rStyle w:val="Hyperlink"/>
@@ -28315,7 +29327,7 @@
       <w:r>
         <w:t xml:space="preserve">(</w:t>
       </w:r>
-      <w:hyperlink r:id="rId66">
+      <w:hyperlink r:id="rId68">
         <w:r>
           <w:rPr>
             <w:rStyle w:val="Hyperlink"/>
@@ -28377,7 +29389,7 @@
       <w:r>
         <w:t xml:space="preserve"> </w:t>
       </w:r>
-      <w:hyperlink r:id="rId62">
+      <w:hyperlink r:id="rId65">
         <w:r>
           <w:rPr>
             <w:rStyle w:val="Hyperlink"/>
@@ -28403,7 +29415,7 @@
       <w:r>
         <w:t xml:space="preserve"> </w:t>
       </w:r>
-      <w:hyperlink r:id="rId67">
+      <w:hyperlink r:id="rId69">
         <w:r>
           <w:rPr>
             <w:rStyle w:val="Hyperlink"/>
@@ -28591,8 +29603,8 @@
         <w:t xml:space="preserve">-finiteness alone does not make the iterated integrals agree.</w:t>
       </w:r>
     </w:p>
-    <w:bookmarkEnd w:id="68"/>
-    <w:bookmarkStart w:id="70" w:name="exm-fubini-tonelli-apply"/>
+    <w:bookmarkEnd w:id="70"/>
+    <w:bookmarkStart w:id="72" w:name="exm-fubini-tonelli-apply"/>
     <w:p>
       <w:pPr>
         <w:pStyle w:val="BodyText"/>
@@ -28611,7 +29623,7 @@
         </w:rPr>
         <w:t xml:space="preserve"> </w:t>
       </w:r>
-      <w:hyperlink w:anchor="thm-fubini-tonelli">
+      <w:hyperlink w:anchor="thm-tonelli-measure">
         <w:r>
           <w:rPr>
             <w:rStyle w:val="Hyperlink"/>
@@ -28676,7 +29688,7 @@
       <w:r>
         <w:t xml:space="preserve"> </w:t>
       </w:r>
-      <w:hyperlink r:id="rId69">
+      <w:hyperlink r:id="rId71">
         <m:oMath>
           <m:r>
             <m:rPr>
@@ -29161,7 +30173,7 @@
       <w:r>
         <w:t xml:space="preserve"> </w:t>
       </w:r>
-      <w:hyperlink w:anchor="thm-fubini-tonelli">
+      <w:hyperlink w:anchor="thm-tonelli-measure">
         <w:r>
           <w:rPr>
             <w:rStyle w:val="Hyperlink"/>
@@ -29274,7 +30286,7 @@
         <w:t xml:space="preserve"> </w:t>
       </w:r>
       <w:r>
-        <w:t xml:space="preserve">condition (a) (Tonelli’s theorem, nonnegativity) is also satisfied.</w:t>
+        <w:t xml:space="preserve">the nonnegativity condition is also satisfied.</w:t>
       </w:r>
     </w:p>
     <w:p>
@@ -29287,7 +30299,7 @@
       <w:r>
         <w:t xml:space="preserve"> </w:t>
       </w:r>
-      <w:hyperlink w:anchor="thm-fubini-tonelli">
+      <w:hyperlink w:anchor="thm-tonelli-measure">
         <w:r>
           <w:rPr>
             <w:rStyle w:val="Hyperlink"/>
@@ -31698,7 +32710,7 @@
       <w:r>
         <w:t xml:space="preserve"> </w:t>
       </w:r>
-      <w:hyperlink w:anchor="thm-fubini-tonelli">
+      <w:hyperlink w:anchor="thm-tonelli-measure">
         <w:r>
           <w:rPr>
             <w:rStyle w:val="Hyperlink"/>
@@ -31710,11 +32722,11 @@
         <w:t xml:space="preserve"> </w:t>
       </w:r>
       <w:r>
-        <w:t xml:space="preserve">guarantees when condition (a) holds.</w:t>
+        <w:t xml:space="preserve">guarantees.</w:t>
       </w:r>
     </w:p>
-    <w:bookmarkEnd w:id="70"/>
-    <w:bookmarkStart w:id="71" w:name="exm-fubini-fail-tonelli"/>
+    <w:bookmarkEnd w:id="72"/>
+    <w:bookmarkStart w:id="73" w:name="exm-fubini-fail-tonelli"/>
     <w:p>
       <w:pPr>
         <w:pStyle w:val="BodyText"/>
@@ -31724,7 +32736,7 @@
           <w:b/>
           <w:bCs/>
         </w:rPr>
-        <w:t xml:space="preserve">Example 7 (When neither Fubini–Tonelli condition is satisfied)</w:t>
+        <w:t xml:space="preserve">Example 7 (When neither Tonelli’s nor Fubini’s condition is satisfied)</w:t>
       </w:r>
       <w:r>
         <w:t xml:space="preserve"> </w:t>
@@ -31890,12 +32902,12 @@
         <w:t xml:space="preserve"> </w:t>
       </w:r>
       <w:r>
-        <w:t xml:space="preserve">illustrates a case where neither condition of</w:t>
-      </w:r>
-      <w:r>
-        <w:t xml:space="preserve"> </w:t>
-      </w:r>
-      <w:hyperlink w:anchor="thm-fubini-tonelli">
+        <w:t xml:space="preserve">illustrates a case where neither the hypothesis of</w:t>
+      </w:r>
+      <w:r>
+        <w:t xml:space="preserve"> </w:t>
+      </w:r>
+      <w:hyperlink w:anchor="thm-tonelli-measure">
         <w:r>
           <w:rPr>
             <w:rStyle w:val="Hyperlink"/>
@@ -31907,6 +32919,23 @@
         <w:t xml:space="preserve"> </w:t>
       </w:r>
       <w:r>
+        <w:t xml:space="preserve">nor that of</w:t>
+      </w:r>
+      <w:r>
+        <w:t xml:space="preserve"> </w:t>
+      </w:r>
+      <w:hyperlink w:anchor="thm-fubini-measure">
+        <w:r>
+          <w:rPr>
+            <w:rStyle w:val="Hyperlink"/>
+          </w:rPr>
+          <w:t xml:space="preserve">Theorem 3</w:t>
+        </w:r>
+      </w:hyperlink>
+      <w:r>
+        <w:t xml:space="preserve"> </w:t>
+      </w:r>
+      <w:r>
         <w:t xml:space="preserve">is satisfied.</w:t>
       </w:r>
     </w:p>
@@ -31919,31 +32948,7 @@
           <w:b/>
           <w:bCs/>
         </w:rPr>
-        <w:t xml:space="preserve">Why</w:t>
-      </w:r>
-      <w:r>
-        <w:rPr>
-          <w:b/>
-          <w:bCs/>
-        </w:rPr>
-        <w:t xml:space="preserve"> </w:t>
-      </w:r>
-      <w:hyperlink w:anchor="thm-fubini-tonelli">
-        <w:r>
-          <w:rPr>
-            <w:rStyle w:val="Hyperlink"/>
-            <w:b/>
-            <w:bCs/>
-          </w:rPr>
-          <w:t xml:space="preserve">Theorem 2</w:t>
-        </w:r>
-      </w:hyperlink>
-      <w:r>
-        <w:rPr>
-          <w:b/>
-          <w:bCs/>
-        </w:rPr>
-        <w:t xml:space="preserve">’s conditions fail:</w:t>
+        <w:t xml:space="preserve">Why the hypotheses fail:</w:t>
       </w:r>
       <w:r>
         <w:t xml:space="preserve"> </w:t>
@@ -32007,7 +33012,27 @@
         </m:r>
       </m:oMath>
       <w:r>
-        <w:t xml:space="preserve">, which violates condition (b).</w:t>
+        <w:t xml:space="preserve">, which violates the absolute-integrability</w:t>
+      </w:r>
+      <w:r>
+        <w:t xml:space="preserve"> </w:t>
+      </w:r>
+      <w:r>
+        <w:t xml:space="preserve">hypothesis of</w:t>
+      </w:r>
+      <w:r>
+        <w:t xml:space="preserve"> </w:t>
+      </w:r>
+      <w:hyperlink w:anchor="thm-fubini-measure">
+        <w:r>
+          <w:rPr>
+            <w:rStyle w:val="Hyperlink"/>
+          </w:rPr>
+          <w:t xml:space="preserve">Theorem 3</w:t>
+        </w:r>
+      </w:hyperlink>
+      <w:r>
+        <w:t xml:space="preserve">.</w:t>
       </w:r>
       <w:r>
         <w:t xml:space="preserve"> </w:t>
@@ -32776,12 +33801,35 @@
         <w:t xml:space="preserve"> </w:t>
       </w:r>
       <w:r>
-        <w:t xml:space="preserve">and condition (b) of</w:t>
-      </w:r>
-      <w:r>
-        <w:t xml:space="preserve"> </w:t>
-      </w:r>
-      <w:hyperlink w:anchor="thm-fubini-tonelli">
+        <w:t xml:space="preserve">and the hypothesis of</w:t>
+      </w:r>
+      <w:r>
+        <w:t xml:space="preserve"> </w:t>
+      </w:r>
+      <w:hyperlink w:anchor="thm-fubini-measure">
+        <w:r>
+          <w:rPr>
+            <w:rStyle w:val="Hyperlink"/>
+          </w:rPr>
+          <w:t xml:space="preserve">Theorem 3</w:t>
+        </w:r>
+      </w:hyperlink>
+      <w:r>
+        <w:t xml:space="preserve"> </w:t>
+      </w:r>
+      <w:r>
+        <w:t xml:space="preserve">is not satisfied.</w:t>
+      </w:r>
+      <w:r>
+        <w:t xml:space="preserve"> </w:t>
+      </w:r>
+      <w:r>
+        <w:t xml:space="preserve">(The hypothesis of</w:t>
+      </w:r>
+      <w:r>
+        <w:t xml:space="preserve"> </w:t>
+      </w:r>
+      <w:hyperlink w:anchor="thm-tonelli-measure">
         <w:r>
           <w:rPr>
             <w:rStyle w:val="Hyperlink"/>
@@ -32793,13 +33841,7 @@
         <w:t xml:space="preserve"> </w:t>
       </w:r>
       <w:r>
-        <w:t xml:space="preserve">is not satisfied.</w:t>
-      </w:r>
-      <w:r>
-        <w:t xml:space="preserve"> </w:t>
-      </w:r>
-      <w:r>
-        <w:t xml:space="preserve">(Condition (a) also fails:</w:t>
+        <w:t xml:space="preserve">also fails:</w:t>
       </w:r>
       <w:r>
         <w:t xml:space="preserve"> </w:t>
@@ -32813,13 +33855,13 @@
         <w:t xml:space="preserve"> </w:t>
       </w:r>
       <w:r>
-        <w:t xml:space="preserve">takes both positive and negative values,</w:t>
-      </w:r>
-      <w:r>
-        <w:t xml:space="preserve"> </w:t>
-      </w:r>
-      <w:r>
-        <w:t xml:space="preserve">so it is not nonnegative a.e.)</w:t>
+        <w:t xml:space="preserve">takes both positive</w:t>
+      </w:r>
+      <w:r>
+        <w:t xml:space="preserve"> </w:t>
+      </w:r>
+      <w:r>
+        <w:t xml:space="preserve">and negative values, so it is not nonnegative a.e.)</w:t>
       </w:r>
       <w:r>
         <w:t xml:space="preserve"> </w:t>
@@ -32848,21 +33890,7 @@
         <w:t xml:space="preserve"> </w:t>
       </w:r>
       <w:r>
-        <w:t xml:space="preserve">with</w:t>
-      </w:r>
-      <w:r>
-        <w:t xml:space="preserve"> </w:t>
-      </w:r>
-      <w:hyperlink w:anchor="thm-fubini-tonelli">
-        <w:r>
-          <w:rPr>
-            <w:rStyle w:val="Hyperlink"/>
-          </w:rPr>
-          <w:t xml:space="preserve">Theorem 2</w:t>
-        </w:r>
-      </w:hyperlink>
-      <w:r>
-        <w:t xml:space="preserve">: the theorem simply does not apply.</w:t>
+        <w:t xml:space="preserve">with both theorems: neither one applies.</w:t>
       </w:r>
     </w:p>
     <w:p>
@@ -32873,9 +33901,9 @@
         <w:t xml:space="preserve">(Wikipedia contributors 2024)</w:t>
       </w:r>
     </w:p>
-    <w:bookmarkEnd w:id="71"/>
-    <w:bookmarkStart w:id="82" w:name="refs"/>
-    <w:bookmarkStart w:id="72" w:name="ref-billingsley1995probability"/>
+    <w:bookmarkEnd w:id="73"/>
+    <w:bookmarkStart w:id="84" w:name="refs"/>
+    <w:bookmarkStart w:id="74" w:name="ref-billingsley1995probability"/>
     <w:p>
       <w:pPr>
         <w:pStyle w:val="Bibliography"/>
@@ -32897,8 +33925,8 @@
         <w:t xml:space="preserve">. 3rd ed. Wiley Series in Probability and Mathematical Statistics. Wiley.</w:t>
       </w:r>
     </w:p>
-    <w:bookmarkEnd w:id="72"/>
-    <w:bookmarkStart w:id="73" w:name="ref-fubini1907"/>
+    <w:bookmarkEnd w:id="74"/>
+    <w:bookmarkStart w:id="75" w:name="ref-fubini1907"/>
     <w:p>
       <w:pPr>
         <w:pStyle w:val="Bibliography"/>
@@ -32929,8 +33957,8 @@
         <w:t xml:space="preserve">16: 608–14.</w:t>
       </w:r>
     </w:p>
-    <w:bookmarkEnd w:id="73"/>
-    <w:bookmarkStart w:id="75" w:name="ref-gut2013"/>
+    <w:bookmarkEnd w:id="75"/>
+    <w:bookmarkStart w:id="77" w:name="ref-gut2013"/>
     <w:p>
       <w:pPr>
         <w:pStyle w:val="Bibliography"/>
@@ -32954,7 +33982,7 @@
       <w:r>
         <w:t xml:space="preserve"> </w:t>
       </w:r>
-      <w:hyperlink r:id="rId74">
+      <w:hyperlink r:id="rId76">
         <w:r>
           <w:rPr>
             <w:rStyle w:val="Hyperlink"/>
@@ -32966,8 +33994,8 @@
         <w:t xml:space="preserve">.</w:t>
       </w:r>
     </w:p>
-    <w:bookmarkEnd w:id="75"/>
-    <w:bookmarkStart w:id="77" w:name="ref-larsonCalc11e"/>
+    <w:bookmarkEnd w:id="77"/>
+    <w:bookmarkStart w:id="79" w:name="ref-larsonCalc11e"/>
     <w:p>
       <w:pPr>
         <w:pStyle w:val="Bibliography"/>
@@ -32991,7 +34019,7 @@
       <w:r>
         <w:t xml:space="preserve"> </w:t>
       </w:r>
-      <w:hyperlink r:id="rId76">
+      <w:hyperlink r:id="rId78">
         <w:r>
           <w:rPr>
             <w:rStyle w:val="Hyperlink"/>
@@ -33003,8 +34031,8 @@
         <w:t xml:space="preserve">.</w:t>
       </w:r>
     </w:p>
-    <w:bookmarkEnd w:id="77"/>
-    <w:bookmarkStart w:id="79" w:name="ref-problifesavercalc"/>
+    <w:bookmarkEnd w:id="79"/>
+    <w:bookmarkStart w:id="81" w:name="ref-problifesavercalc"/>
     <w:p>
       <w:pPr>
         <w:pStyle w:val="Bibliography"/>
@@ -33028,7 +34056,7 @@
       <w:r>
         <w:t xml:space="preserve"> </w:t>
       </w:r>
-      <w:hyperlink r:id="rId78">
+      <w:hyperlink r:id="rId80">
         <w:r>
           <w:rPr>
             <w:rStyle w:val="Hyperlink"/>
@@ -33040,8 +34068,8 @@
         <w:t xml:space="preserve">.</w:t>
       </w:r>
     </w:p>
-    <w:bookmarkEnd w:id="79"/>
-    <w:bookmarkStart w:id="81" w:name="ref-wp:fubini"/>
+    <w:bookmarkEnd w:id="81"/>
+    <w:bookmarkStart w:id="83" w:name="ref-wp:fubini"/>
     <w:p>
       <w:pPr>
         <w:pStyle w:val="Bibliography"/>
@@ -33100,7 +34128,7 @@
       <w:r>
         <w:t xml:space="preserve"> </w:t>
       </w:r>
-      <w:hyperlink r:id="rId80">
+      <w:hyperlink r:id="rId82">
         <w:r>
           <w:rPr>
             <w:rStyle w:val="Hyperlink"/>
@@ -33112,9 +34140,9 @@
         <w:t xml:space="preserve">.</w:t>
       </w:r>
     </w:p>
-    <w:bookmarkEnd w:id="81"/>
-    <w:bookmarkEnd w:id="82"/>
     <w:bookmarkEnd w:id="83"/>
+    <w:bookmarkEnd w:id="84"/>
+    <w:bookmarkEnd w:id="85"/>
     <w:sectPr>
       <w:footnotePr>
         <w:numRestart w:val="eachSect"/>
@@ -33310,126 +34338,11 @@
       </w:pPr>
     </w:lvl>
   </w:abstractNum>
-  <w:abstractNum w:abstractNumId="99731">
-    <w:nsid w:val="00A99731"/>
-    <w:multiLevelType w:val="multilevel"/>
-    <w:lvl w:ilvl="0">
-      <w:start w:val="1"/>
-      <w:numFmt w:val="lowerLetter"/>
-      <w:lvlText w:val="(%1)"/>
-      <w:lvlJc w:val="left"/>
-      <w:pPr>
-        <w:ind w:left="720" w:hanging="360"/>
-      </w:pPr>
-    </w:lvl>
-    <w:lvl w:ilvl="1">
-      <w:start w:val="1"/>
-      <w:numFmt w:val="lowerLetter"/>
-      <w:lvlText w:val="(%2)"/>
-      <w:lvlJc w:val="left"/>
-      <w:pPr>
-        <w:ind w:left="1440" w:hanging="360"/>
-      </w:pPr>
-    </w:lvl>
-    <w:lvl w:ilvl="2">
-      <w:start w:val="1"/>
-      <w:numFmt w:val="lowerLetter"/>
-      <w:lvlText w:val="(%3)"/>
-      <w:lvlJc w:val="left"/>
-      <w:pPr>
-        <w:ind w:left="2160" w:hanging="360"/>
-      </w:pPr>
-    </w:lvl>
-    <w:lvl w:ilvl="3">
-      <w:start w:val="1"/>
-      <w:numFmt w:val="lowerLetter"/>
-      <w:lvlText w:val="(%4)"/>
-      <w:lvlJc w:val="left"/>
-      <w:pPr>
-        <w:ind w:left="2880" w:hanging="360"/>
-      </w:pPr>
-    </w:lvl>
-    <w:lvl w:ilvl="4">
-      <w:start w:val="1"/>
-      <w:numFmt w:val="lowerLetter"/>
-      <w:lvlText w:val="(%5)"/>
-      <w:lvlJc w:val="left"/>
-      <w:pPr>
-        <w:ind w:left="3600" w:hanging="360"/>
-      </w:pPr>
-    </w:lvl>
-    <w:lvl w:ilvl="5">
-      <w:start w:val="1"/>
-      <w:numFmt w:val="lowerLetter"/>
-      <w:lvlText w:val="(%6)"/>
-      <w:lvlJc w:val="left"/>
-      <w:pPr>
-        <w:ind w:left="4320" w:hanging="360"/>
-      </w:pPr>
-    </w:lvl>
-    <w:lvl w:ilvl="6">
-      <w:start w:val="1"/>
-      <w:numFmt w:val="lowerLetter"/>
-      <w:lvlText w:val="(%7)"/>
-      <w:lvlJc w:val="left"/>
-      <w:pPr>
-        <w:ind w:left="5040" w:hanging="360"/>
-      </w:pPr>
-    </w:lvl>
-    <w:lvl w:ilvl="7">
-      <w:start w:val="1"/>
-      <w:numFmt w:val="lowerLetter"/>
-      <w:lvlText w:val="(%8)"/>
-      <w:lvlJc w:val="left"/>
-      <w:pPr>
-        <w:ind w:left="5760" w:hanging="360"/>
-      </w:pPr>
-    </w:lvl>
-    <w:lvl w:ilvl="8">
-      <w:start w:val="1"/>
-      <w:numFmt w:val="lowerLetter"/>
-      <w:lvlText w:val="(%9)"/>
-      <w:lvlJc w:val="left"/>
-      <w:pPr>
-        <w:ind w:left="6480" w:hanging="360"/>
-      </w:pPr>
-    </w:lvl>
-  </w:abstractNum>
   <w:num w:numId="1000">
     <w:abstractNumId w:val="990"/>
   </w:num>
   <w:num w:numId="1001">
     <w:abstractNumId w:val="99411"/>
-    <w:lvlOverride w:ilvl="0">
-      <w:startOverride w:val="1"/>
-    </w:lvlOverride>
-    <w:lvlOverride w:ilvl="1">
-      <w:startOverride w:val="1"/>
-    </w:lvlOverride>
-    <w:lvlOverride w:ilvl="2">
-      <w:startOverride w:val="1"/>
-    </w:lvlOverride>
-    <w:lvlOverride w:ilvl="3">
-      <w:startOverride w:val="1"/>
-    </w:lvlOverride>
-    <w:lvlOverride w:ilvl="4">
-      <w:startOverride w:val="1"/>
-    </w:lvlOverride>
-    <w:lvlOverride w:ilvl="5">
-      <w:startOverride w:val="1"/>
-    </w:lvlOverride>
-    <w:lvlOverride w:ilvl="6">
-      <w:startOverride w:val="1"/>
-    </w:lvlOverride>
-    <w:lvlOverride w:ilvl="7">
-      <w:startOverride w:val="1"/>
-    </w:lvlOverride>
-    <w:lvlOverride w:ilvl="8">
-      <w:startOverride w:val="1"/>
-    </w:lvlOverride>
-  </w:num>
-  <w:num w:numId="1002">
-    <w:abstractNumId w:val="99731"/>
     <w:lvlOverride w:ilvl="0">
       <w:startOverride w:val="1"/>
     </w:lvlOverride>

</xml_diff>